<commit_message>
chore: reduz tamanho dos modelos docx de petições
</commit_message>
<xml_diff>
--- a/Petições/Bloqueio cartões de crédito e suspensão CNH.docx
+++ b/Petições/Bloqueio cartões de crédito e suspensão CNH.docx
@@ -762,7 +762,7 @@
       <w:r>
         <w:rPr>
           <w:rFonts w:ascii="Calibri" w:hAnsi="Calibri" w:cs="Calibri,Bold"/>
-          <w:b/>
+          <w:b w:val="0"/>
           <w:bCs/>
           <w:color w:val="000000"/>
           <w:sz w:val="24"/>
@@ -774,7 +774,7 @@
       <w:r>
         <w:rPr>
           <w:rFonts w:ascii="Calibri" w:hAnsi="Calibri" w:cs="Calibri,Bold"/>
-          <w:b/>
+          <w:b w:val="0"/>
           <w:bCs/>
           <w:color w:val="000000"/>
           <w:sz w:val="24"/>
@@ -785,7 +785,7 @@
       <w:r>
         <w:rPr>
           <w:rFonts w:ascii="Calibri" w:hAnsi="Calibri" w:cs="Calibri,Bold"/>
-          <w:b/>
+          <w:b w:val="0"/>
           <w:bCs/>
           <w:color w:val="000000"/>
           <w:sz w:val="24"/>

</xml_diff>